<commit_message>
Add revision_calculations: QE inputs and queue for the reviewer-requested runs
Jobs 1-5 (default queue, about 4-8 days on the i5-3570): cut-off 55/70 Ry
with 40 Ry references and O2 boxes, pristine V_O at 2x2x2, smearing tests
with -TS, D3 on the remaining cells and O2, nosym O-seeded spin search on
the Rb cells. Jobs 6-8 (RUN_P2=1): nosym re-relaxation if lower, dual-U
Pr_VO with dual-U O2, optional completion of dual-U Rb_VO, tight
relaxations. Job 9 (RUN_P3=1): hp.x linear-response U. Seeded-oxygen
species labelled O1; dry run builds 37 consistent inputs. Run plan in the
response document aligned with the README.

Co-Authored-By: Claude Opus 5.5 <noreply@anthropic.com>
Claude-Session: https://claude.ai/code/session_011m1nWiFCs4xdp8CXy2DSzu
</commit_message>
<xml_diff>
--- a/DFT_paper_revision/response_to_audit/Editorial_Pass_Log.docx
+++ b/DFT_paper_revision/response_to_audit/Editorial_Pass_Log.docx
@@ -26885,7 +26885,43 @@
               <w:t xml:space="preserve"> </w:t>
             </w:r>
             <w:r>
-              <w:t xml:space="preserve">(jobs 1–10; see its README).</w:t>
+              <w:t xml:space="preserve">(jobs 1–10 plus 7b; see its README). Reviewed: the seeded-oxygen species label changed from</w:t>
+            </w:r>
+            <w:r>
+              <w:t xml:space="preserve"> </w:t>
+            </w:r>
+            <w:r>
+              <w:t xml:space="preserve">“</w:t>
+            </w:r>
+            <w:r>
+              <w:t xml:space="preserve">Oh</w:t>
+            </w:r>
+            <w:r>
+              <w:t xml:space="preserve">”</w:t>
+            </w:r>
+            <w:r>
+              <w:t xml:space="preserve"> </w:t>
+            </w:r>
+            <w:r>
+              <w:t xml:space="preserve">to</w:t>
+            </w:r>
+            <w:r>
+              <w:t xml:space="preserve"> </w:t>
+            </w:r>
+            <w:r>
+              <w:t xml:space="preserve">“</w:t>
+            </w:r>
+            <w:r>
+              <w:t xml:space="preserve">O1</w:t>
+            </w:r>
+            <w:r>
+              <w:t xml:space="preserve">”</w:t>
+            </w:r>
+            <w:r>
+              <w:t xml:space="preserve"> </w:t>
+            </w:r>
+            <w:r>
+              <w:t xml:space="preserve">(element symbol plus digit, the documented form). A dry run against stand-in production outputs built 37 inputs; nat, ntyp, species, starting-magnetisation indices and HUBBARD labels are consistent in all of them. Wall times re-based on SI Table S6 (P1: 26 runs, 4–8 days).</w:t>
             </w:r>
           </w:p>
         </w:tc>

</xml_diff>